<commit_message>
Lampiran A: maklumbalas muat turun + perbaiki nota templat
- MinePergerakanCardActions: tukar <a href> kepada fetch blob supaya
  pengguna nampak status Memuat turun / Selesai / Gagal
- lampiran-a-template.docx: kecilkan saiz fon nota kaki supaya teks
  tidak patah baris di luar tempat pada paparan mudah alih

Co-Authored-By: Claude Sonnet 4.6 <noreply@anthropic.com>
</commit_message>
<xml_diff>
--- a/egerak-v2/public/templates/lampiran-a-template.docx
+++ b/egerak-v2/public/templates/lampiran-a-template.docx
@@ -1738,6 +1738,10 @@
         <w:spacing w:after="0" w:line="259" w:lineRule="auto"/>
         <w:ind w:left="1051" w:firstLine="0"/>
         <w:jc w:val="center"/>
+        <w:rPr>
+          <w:rFonts w:eastAsiaTheme="minorEastAsia" w:hint="eastAsia"/>
+          <w:lang w:eastAsia="zh-CN"/>
+        </w:rPr>
       </w:pPr>
       <w:r>
         <w:t xml:space="preserve"> </w:t>
@@ -1750,46 +1754,88 @@
         </w:tabs>
         <w:ind w:left="-15" w:firstLine="0"/>
         <w:jc w:val="left"/>
-      </w:pPr>
-      <w:r>
+        <w:rPr>
+          <w:sz w:val="16"/>
+          <w:szCs w:val="16"/>
+        </w:rPr>
+      </w:pPr>
+      <w:r>
+        <w:rPr>
+          <w:sz w:val="16"/>
+          <w:szCs w:val="16"/>
+        </w:rPr>
         <w:t xml:space="preserve">Nota </w:t>
       </w:r>
       <w:r>
-        <w:tab/>
+        <w:rPr>
+          <w:rFonts w:eastAsiaTheme="minorEastAsia" w:hint="eastAsia"/>
+          <w:sz w:val="16"/>
+          <w:szCs w:val="16"/>
+          <w:lang w:eastAsia="zh-CN"/>
+        </w:rPr>
+        <w:t xml:space="preserve">        </w:t>
+      </w:r>
+      <w:r>
+        <w:rPr>
+          <w:sz w:val="16"/>
+          <w:szCs w:val="16"/>
+        </w:rPr>
         <w:t xml:space="preserve">*   Sila potong mana-mana yang tidak berkenaan </w:t>
       </w:r>
     </w:p>
     <w:p>
       <w:pPr>
         <w:ind w:left="730" w:right="27"/>
-      </w:pPr>
-      <w:r>
+        <w:rPr>
+          <w:sz w:val="16"/>
+          <w:szCs w:val="16"/>
+        </w:rPr>
+      </w:pPr>
+      <w:r>
+        <w:rPr>
+          <w:sz w:val="16"/>
+          <w:szCs w:val="16"/>
+        </w:rPr>
         <w:t xml:space="preserve">** Jarak perjalanan yang melebihi 240 km sehala dari  Ibu Pejabat adalah layak dipertimbangkan elaun tambang gantian         </w:t>
       </w:r>
       <w:r>
+        <w:rPr>
+          <w:sz w:val="16"/>
+          <w:szCs w:val="16"/>
+        </w:rPr>
         <w:t xml:space="preserve">   </w:t>
       </w:r>
     </w:p>
     <w:p>
       <w:pPr>
         <w:ind w:left="730" w:right="27"/>
-      </w:pPr>
-      <w:r>
-        <w:t xml:space="preserve">     </w:t>
-      </w:r>
-      <w:r>
-        <w:t xml:space="preserve">kapal terbang atau keretapi. </w:t>
+        <w:rPr>
+          <w:sz w:val="16"/>
+          <w:szCs w:val="16"/>
+        </w:rPr>
+      </w:pPr>
+      <w:r>
+        <w:rPr>
+          <w:sz w:val="16"/>
+          <w:szCs w:val="16"/>
+        </w:rPr>
+        <w:t xml:space="preserve">     kapal terbang atau keretapi. </w:t>
       </w:r>
     </w:p>
     <w:p>
       <w:pPr>
         <w:ind w:left="912" w:right="27"/>
-      </w:pPr>
-      <w:r>
-        <w:t xml:space="preserve"> </w:t>
-      </w:r>
-      <w:r>
-        <w:t xml:space="preserve">Para 4.7.3 Pekeliling Perbendaharaan Bil 3 Tahun 2003 &amp; Bab B perkara 22 dirujuk. </w:t>
+        <w:rPr>
+          <w:sz w:val="16"/>
+          <w:szCs w:val="16"/>
+        </w:rPr>
+      </w:pPr>
+      <w:r>
+        <w:rPr>
+          <w:sz w:val="16"/>
+          <w:szCs w:val="16"/>
+        </w:rPr>
+        <w:t xml:space="preserve"> Para 4.7.3 Pekeliling Perbendaharaan Bil 3 Tahun 2003 &amp; Bab B perkara 22 dirujuk. </w:t>
       </w:r>
     </w:p>
     <w:p>

</xml_diff>

<commit_message>
Lampiran A: perbaiki tarikh TEMPOH dan penjajaran Tarikh kanan.
Format julat tarikh lebih padat supaya tidak pecah baris dalam lajur sempit, dan templat Word digayakan semula untuk elak Tarikh kanan lari kedudukan semasa muat turun.

Co-authored-by: Cursor <cursoragent@cursor.com>
</commit_message>
<xml_diff>
--- a/egerak-v2/public/templates/lampiran-a-template.docx
+++ b/egerak-v2/public/templates/lampiran-a-template.docx
@@ -306,6 +306,7 @@
         <w:tc>
           <w:tcPr>
             <w:tcW w:w="2520" w:type="dxa"/>
+            <w:noWrap/>
             <w:tcBorders>
               <w:top w:val="single" w:sz="4" w:space="0" w:color="000000"/>
               <w:left w:val="single" w:sz="4" w:space="0" w:color="000000"/>
@@ -440,6 +441,7 @@
         <w:tc>
           <w:tcPr>
             <w:tcW w:w="2520" w:type="dxa"/>
+            <w:noWrap/>
             <w:tcBorders>
               <w:top w:val="single" w:sz="4" w:space="0" w:color="000000"/>
               <w:left w:val="single" w:sz="4" w:space="0" w:color="000000"/>
@@ -471,7 +473,8 @@
             </w:pPr>
             <w:r>
               <w:rPr>
-                <w:b/>
+                <w:sz w:val="18"/>
+                <w:szCs w:val="18"/>
               </w:rPr>
               <w:t>[[tempoh]]</w:t>
             </w:r>
@@ -1276,10 +1279,7 @@
         <w:tab/>
       </w:r>
       <w:r>
-        <w:t>Tarik</w:t>
-      </w:r>
-      <w:r>
-        <w:t>h</w:t>
+        <w:t xml:space="preserve">Tarikh </w:t>
       </w:r>
       <w:r>
         <w:tab/>

</xml_diff>